<commit_message>
Remove página em branco ao final do Plano Nº 019/2026
Co-Authored-By: Claude Opus 5.5 <noreply@anthropic.com>
Claude-Session: https://claude.ai/code/session_01Sahi55126JzsF8DB6DZ3fC
</commit_message>
<xml_diff>
--- a/out/PLANO_DE_OPERACOES_N_019_Operacao_Verao_2026-2027.docx
+++ b/out/PLANO_DE_OPERACOES_N_019_Operacao_Verao_2026-2027.docx
@@ -10183,13 +10183,10 @@
     </w:tbl>
     <w:p>
       <w:pPr>
-        <w:rPr>
-          <w:rFonts w:ascii="Verdana" w:hAnsi="Verdana"/>
-          <w:b/>
-          <w:bCs/>
-          <w:color w:val="000000" w:themeColor="text1"/>
-          <w:sz w:val="20"/>
-          <w:szCs w:val="20"/>
+        <w:spacing w:before="0" w:after="0" w:line="20" w:lineRule="exact"/>
+        <w:rPr>
+          <w:sz w:val="2"/>
+          <w:szCs w:val="2"/>
         </w:rPr>
       </w:pPr>
     </w:p>

</xml_diff>